<commit_message>
feat(release): publish static musl releases on push to main
- Add release workflow building static musl binaries for x86_64 and aarch64
- Switch reqwest/sentry TLS to rustls so binaries link fully static
- Update install.sh for musl release assets and default repo
</commit_message>
<xml_diff>
--- a/docs/bridge_v3 .docx
+++ b/docs/bridge_v3 .docx
@@ -2186,13 +2186,7 @@
         <w:ind w:left="360"/>
       </w:pPr>
       <w:r>
-        <w:rPr>
-          <w:rFonts w:ascii="Courier New" w:cs="Courier New" w:eastAsia="Courier New" w:hAnsi="Courier New"/>
-          <w:color w:val="1E293B"/>
-          <w:sz w:val="18"/>
-          <w:szCs w:val="18"/>
-        </w:rPr>
-        <w:t xml:space="preserve">  Requests peer list from seed over gRPC</w:t>
+        <w:t xml:space="preserve">  Requests peer list from seed over raw UDP</w:t>
       </w:r>
     </w:p>
     <w:p>
@@ -3278,17 +3272,7 @@
         <w:spacing w:after="100" w:before="80"/>
       </w:pPr>
       <w:r>
-        <w:rPr>
-          <w:rFonts w:ascii="Calibri" w:cs="Calibri" w:eastAsia="Calibri" w:hAnsi="Calibri"/>
-          <w:b w:val="false"/>
-          <w:bCs w:val="false"/>
-          <w:i w:val="false"/>
-          <w:iCs w:val="false"/>
-          <w:color w:val="0F172A"/>
-          <w:sz w:val="22"/>
-          <w:szCs w:val="22"/>
-        </w:rPr>
-        <w:t xml:space="preserve">Uses a variant of the bully algorithm. When a peer detects missed leader heartbeats (after TTL), it initiates election by broadcasting an ELECTION message to all peers with higher node IDs over the WireGuard mesh via gRPC.</w:t>
+        <w:t>Uses a variant of the bully algorithm. When a peer detects missed leader heartbeats (after TTL), it initiates election by broadcasting an ELECTION message to all peers with higher node IDs over the WireGuard mesh via raw UDP.</w:t>
       </w:r>
     </w:p>
     <w:p>
@@ -9929,13 +9913,7 @@
           </w:tcPr>
           <w:p>
             <w:r>
-              <w:rPr>
-                <w:rFonts w:ascii="Calibri" w:cs="Calibri" w:eastAsia="Calibri" w:hAnsi="Calibri"/>
-                <w:color w:val="0F172A"/>
-                <w:sz w:val="20"/>
-                <w:szCs w:val="20"/>
-              </w:rPr>
-              <w:t xml:space="preserve">tonic (gRPC over WireGuard)</w:t>
+              <w:t>Raw UDP Datagram Mesh</w:t>
             </w:r>
           </w:p>
         </w:tc>
@@ -13860,13 +13838,7 @@
           </w:tcPr>
           <w:p>
             <w:r>
-              <w:rPr>
-                <w:rFonts w:ascii="Calibri" w:cs="Calibri" w:eastAsia="Calibri" w:hAnsi="Calibri"/>
-                <w:color w:val="0F172A"/>
-                <w:sz w:val="20"/>
-                <w:szCs w:val="20"/>
-              </w:rPr>
-              <w:t xml:space="preserve">Two nodes connected over WireGuard. Programmatic peer management. Basic gRPC between peers.</w:t>
+              <w:t>Two nodes connected over WireGuard. Programmatic peer management. Raw UDP datagram peer exchange.</w:t>
             </w:r>
           </w:p>
         </w:tc>

</xml_diff>